<commit_message>
vaijes y responsive de index y casi toda la pagina
Co-authored-by: Copilot <copilot@github.com>
</commit_message>
<xml_diff>
--- a/P1/P1_Entrega/docs/como_se_hizo.docx
+++ b/P1/P1_Entrega/docs/como_se_hizo.docx
@@ -227,13 +227,44 @@
     <w:p>
       <w:pPr>
         <w:ind w:left="708" w:hanging="708"/>
+      </w:pPr>
+      <w:hyperlink r:id="rId11" w:history="1">
+        <w:r>
+          <w:rPr>
+            <w:rStyle w:val="Hipervnculo"/>
+          </w:rPr>
+          <w:t>https://www.w3schools.com/w3css/w3css_sidebar.asp</w:t>
+        </w:r>
+      </w:hyperlink>
+    </w:p>
+    <w:p>
+      <w:pPr>
+        <w:ind w:left="708" w:hanging="708"/>
+      </w:pPr>
+    </w:p>
+    <w:p>
+      <w:pPr>
+        <w:ind w:left="708" w:hanging="708"/>
+      </w:pPr>
+      <w:r>
+        <w:t xml:space="preserve">fuentes: </w:t>
+      </w:r>
+      <w:hyperlink r:id="rId12" w:history="1">
+        <w:r>
+          <w:rPr>
+            <w:rStyle w:val="Hipervnculo"/>
+          </w:rPr>
+          <w:t>https://www.w3schools.com/css/css_font_fallbacks.asp</w:t>
+        </w:r>
+      </w:hyperlink>
+    </w:p>
+    <w:p>
+      <w:pPr>
+        <w:ind w:left="708" w:hanging="708"/>
         <w:rPr>
           <w:u w:val="single"/>
         </w:rPr>
       </w:pPr>
-      <w:r>
-        <w:t>https://www.w3schools.com/w3css/w3css_sidebar.asp</w:t>
-      </w:r>
     </w:p>
     <w:sectPr>
       <w:pgSz w:w="11906" w:h="16838"/>

</xml_diff>